<commit_message>
v34 polish: §7.3 heading, pipeline console language, A.1 harmonized trust rows
</commit_message>
<xml_diff>
--- a/outputs/adoption_paper_v34.docx
+++ b/outputs/adoption_paper_v34.docx
@@ -4144,11 +4144,6 @@
     </w:p>
     <w:p>
       <w:pPr>
-        <w:spacing w:before="200" w:after="0"/>
-      </w:pPr>
-    </w:p>
-    <w:p>
-      <w:pPr>
         <w:spacing w:before="0" w:after="160" w:line="320"/>
         <w:jc w:val="left"/>
       </w:pPr>
@@ -9887,7 +9882,7 @@
           <w:sz w:val="28"/>
           <w:szCs w:val="28"/>
         </w:rPr>
-        <w:t xml:space="preserve">7.3  How Learning Method Predicts Trust</w:t>
+        <w:t xml:space="preserve">7.3  How Learning Method Is Associated With Trust</w:t>
       </w:r>
     </w:p>
     <w:p>
@@ -15394,6 +15389,90 @@
       <w:tr>
         <w:tc>
           <w:tcPr>
+            <w:shd w:val="clear" w:color="auto" w:fill="EFF3FF"/>
+          </w:tcPr>
+          <w:p>
+            <w:r>
+              <w:t xml:space="preserve">High Trust (harmonized†)</w:t>
+            </w:r>
+          </w:p>
+        </w:tc>
+        <w:tc>
+          <w:tcPr>
+            <w:shd w:val="clear" w:color="auto" w:fill="EFF3FF"/>
+          </w:tcPr>
+          <w:p>
+            <w:r>
+              <w:t xml:space="preserve">42.2%</w:t>
+            </w:r>
+          </w:p>
+        </w:tc>
+        <w:tc>
+          <w:tcPr>
+            <w:shd w:val="clear" w:color="auto" w:fill="EFF3FF"/>
+          </w:tcPr>
+          <w:p>
+            <w:r>
+              <w:t xml:space="preserve">43.0%</w:t>
+            </w:r>
+          </w:p>
+        </w:tc>
+        <w:tc>
+          <w:tcPr>
+            <w:shd w:val="clear" w:color="auto" w:fill="EFF3FF"/>
+          </w:tcPr>
+          <w:p>
+            <w:r>
+              <w:t xml:space="preserve">39.3%*</w:t>
+            </w:r>
+          </w:p>
+        </w:tc>
+      </w:tr>
+      <w:tr>
+        <w:tc>
+          <w:tcPr>
+            <w:shd w:val="clear" w:color="auto" w:fill="EFF3FF"/>
+          </w:tcPr>
+          <w:p>
+            <w:r>
+              <w:t xml:space="preserve">High Distrust (harmonized†)</w:t>
+            </w:r>
+          </w:p>
+        </w:tc>
+        <w:tc>
+          <w:tcPr>
+            <w:shd w:val="clear" w:color="auto" w:fill="EFF3FF"/>
+          </w:tcPr>
+          <w:p>
+            <w:r>
+              <w:t xml:space="preserve">27.2%</w:t>
+            </w:r>
+          </w:p>
+        </w:tc>
+        <w:tc>
+          <w:tcPr>
+            <w:shd w:val="clear" w:color="auto" w:fill="EFF3FF"/>
+          </w:tcPr>
+          <w:p>
+            <w:r>
+              <w:t xml:space="preserve">30.4%</w:t>
+            </w:r>
+          </w:p>
+        </w:tc>
+        <w:tc>
+          <w:tcPr>
+            <w:shd w:val="clear" w:color="auto" w:fill="EFF3FF"/>
+          </w:tcPr>
+          <w:p>
+            <w:r>
+              <w:t xml:space="preserve">37.3%*</w:t>
+            </w:r>
+          </w:p>
+        </w:tc>
+      </w:tr>
+      <w:tr>
+        <w:tc>
+          <w:tcPr>
             <w:tcW w:type="dxa" w:w="2340"/>
             <w:tcBorders>
               <w:top w:val="single" w:color="CCCCCC" w:sz="4"/>
@@ -16008,6 +16087,14 @@
         </w:tc>
       </w:tr>
     </w:tbl>
+    <w:p>
+      <w:r>
+        <w:rPr>
+          <w:sz w:val="18"/>
+        </w:rPr>
+        <w:t xml:space="preserve">† Harmonized: 2025 restricted to current AI users only (n≈ 26,126), routing-comparable to 2023/2024. * See §4.2 and §10.2 for discussion.</w:t>
+      </w:r>
+    </w:p>
     <w:p>
       <w:pPr>
         <w:spacing w:before="80" w:after="240"/>

</xml_diff>